<commit_message>
fix: BUG #1 — Scenario Manager TypeError crash on Financial page
PROBLEM: json.loads() was called on config_json which could be
either a string (from DB) or already-parsed dict (from database.py
auto-parsing). This caused:
  TypeError: the JSON object must be str, bytes or bytearray, not dict

FIX: Added isinstance() check before json.loads():
  snap = json.loads(raw) if isinstance(raw, str) else (raw if isinstance(raw, dict) else {})

This handles both cases safely — string from DB gets parsed,
dict that's already parsed gets used directly.

VERIFIED: Test confirms no crash with both string and dict inputs.

Also scanned entire codebase — no other json.loads on config_json found.

Co-Authored-By: Claude Opus 4.6 (1M context) <noreply@anthropic.com>
</commit_message>
<xml_diff>
--- a/data/auto_synced/Bank_Proposal_20MT_Uttar_Pradesh.docx
+++ b/data/auto_synced/Bank_Proposal_20MT_Uttar_Pradesh.docx
@@ -127,7 +127,7 @@
           </w:tcPr>
           <w:p>
             <w:r>
-              <w:t>Rs 4.80 Crore</w:t>
+              <w:t>Rs 4.00 Crore</w:t>
             </w:r>
           </w:p>
         </w:tc>
@@ -149,7 +149,7 @@
           </w:tcPr>
           <w:p>
             <w:r>
-              <w:t>Rs 3.20 Crore</w:t>
+              <w:t>Rs 4.00 Crore</w:t>
             </w:r>
           </w:p>
         </w:tc>
@@ -171,7 +171,7 @@
           </w:tcPr>
           <w:p>
             <w:r>
-              <w:t>11.5% p.a.</w:t>
+              <w:t>14.0% p.a.</w:t>
             </w:r>
           </w:p>
         </w:tc>
@@ -215,7 +215,7 @@
           </w:tcPr>
           <w:p>
             <w:r>
-              <w:t>Rs 8.35 Lakhs</w:t>
+              <w:t>Rs 7.50 Lakhs</w:t>
             </w:r>
           </w:p>
         </w:tc>
@@ -237,7 +237,7 @@
           </w:tcPr>
           <w:p>
             <w:r>
-              <w:t>1.93x (Bank minimum: 1.50x)</w:t>
+              <w:t>2.14x (Bank minimum: 1.50x)</w:t>
             </w:r>
           </w:p>
         </w:tc>
@@ -333,7 +333,7 @@
           </w:tcPr>
           <w:p>
             <w:r>
-              <w:t>20.7%</w:t>
+              <w:t>20.6%</w:t>
             </w:r>
           </w:p>
         </w:tc>
@@ -355,7 +355,7 @@
           </w:tcPr>
           <w:p>
             <w:r>
-              <w:t>32.2%</w:t>
+              <w:t>26.1%</w:t>
             </w:r>
           </w:p>
         </w:tc>

</xml_diff>